<commit_message>
Book 4: qualify QRP propagation claim; refresh review
</commit_message>
<xml_diff>
--- a/EE - SERIES/RF_Microwave_and_Transceivers_Book4.docx
+++ b/EE - SERIES/RF_Microwave_and_Transceivers_Book4.docx
@@ -26524,7 +26524,7 @@
     </w:p>
     <w:p>
       <w:r>
-        <w:t>A coil, a variable capacitor, a germanium diode, and a long wire will pull a radio station out of the air with no battery at all. A few more parts make a Morse transmitter that reaches across a continent on a watt, and a twenty-dollar USB dongle receives everything from aircraft to weather satellites. Building them teaches the ideas of this book faster than any amount of reading.</w:t>
+        <w:t>A coil, a variable capacitor, a germanium diode, and a long wire will pull a radio station out of the air with no battery at all. A few more parts make a Morse transmitter that can reach across a continent on a watt when propagation and the antenna cooperate, and a twenty-dollar USB dongle can receive signals from aircraft and weather satellites.</w:t>
       </w:r>
     </w:p>
     <w:p>
@@ -32920,17 +32920,8 @@
       </w:r>
     </w:p>
     <w:p>
-      <w:hyperlink r:id="rId114" w:history="1">
-        <w:r>
-          <w:rPr>
-            <w:color w:val="0563C1"/>
-            <w:u w:val="single"/>
-          </w:rPr>
-          <w:t>The ARRL Handbook for Radio Communications</w:t>
-        </w:r>
-      </w:hyperlink>
-      <w:r>
-        <w:t>; 47 CFR Part 97 (sections 97.301 and 97.307); and the RTL-SDR and NanoVNA project documentation, for Chapter 51.</w:t>
+      <w:r>
+        <w:t>The ARRL Handbook for Radio Communications; 47 CFR Part 97 (sections 97.301 and 97.307); and the RTL-SDR and NanoVNA project documentation, for Chapter 51. ARRL, "HF Propagation: The Basics" (ionospheric propagation depends on band, time, and solar conditions): https://www.arrl.org/files/file/Technology/tis/info/pdf/8312011.pdf (accessed 13 October 2026).</w:t>
       </w:r>
     </w:p>
     <w:p>

</xml_diff>

<commit_message>
Book 4: clarify device technology roadmap
</commit_message>
<xml_diff>
--- a/EE - SERIES/RF_Microwave_and_Transceivers_Book4.docx
+++ b/EE - SERIES/RF_Microwave_and_Transceivers_Book4.docx
@@ -70,16 +70,25 @@
     </w:p>
     <w:p>
       <w:r>
-        <w:t>Part II, Chapters 20 to 41, is the active radio. It follows a transmitter from the device to the antenna, through the load line, the amplifier classes, the Doherty amplifier, heat and combining, and then the receiver's noise and dynamic range, the oscillator and the PLL, and radar. Chapters 28 to 40 deepen the chain: the low-noise amplifier, mixers and frequency planning, the link budget, bias and ruggedness, vacuum tubes, RF exposure, transceiver isolation, class E and F design, envelope tracking and outph</w:t>
-      </w:r>
-      <w:r>
-        <w:t>asing, amplifier measurement, digital predistortion, frequency synthesis, and power detection and control. Chapter 41 sets the amplifier classes side by side, from A to S, Doherty, and outphasing, and shows how a supply that tracks the envelope, and rises above its nominal rail on the peaks, raises the average efficiency of any of them. Part III, Chapters 42 to 47, takes the amplifier and the front end down to their device technologies: the CMOS power amplifier and how it beats its breakdown limit, a design</w:t>
-      </w:r>
-      <w:r>
-        <w:t xml:space="preserve"> cookbook class by class, the gallium arsenide handset amplifier and pHEMT, gallium nitride broadband and Doherty amplifiers, RF SOI switches, silicon-germanium and indium phosphide at millimeter waves, and the acoustic filters of the smartphone front end. Part IV, Chapters 48 to 52, starts from measured data and ends on the bench: Touchstone files and noise parameters, FMCW radar front ends, microwave photonics and optical phased arrays, receivers a reader can build, and antennas for satellites, GPS, LoRa,</w:t>
-      </w:r>
-      <w:r>
-        <w:t xml:space="preserve"> and the radio sky.</w:t>
+        <w:t>Part II, Chapters 20 to 41, follows the active radio from transmitter to antenna and through the receiver, oscillator, and radar. It covers the load line, amplifier classes, Doherty amplification, heat and power combining, receiver noise and dynamic range, the oscillator and PLL, and radar.</w:t>
+      </w:r>
+    </w:p>
+    <w:p>
+      <w:pPr/>
+      <w:r>
+        <w:t>Chapters 28 to 40 deepen this chain: the low-noise amplifier, mixers and frequency planning, the link budget, bias and ruggedness, vacuum tubes, RF exposure, transceiver isolation, class E and F design, envelope tracking and outphasing, amplifier measurement, digital predistortion, frequency synthesis, and power detection and control. Chapter 41 compares amplifier classes A through S, Doherty, and outphasing, then explains how an envelope-tracking supply can raise average efficiency by boosting its rail on signal peaks.</w:t>
+      </w:r>
+    </w:p>
+    <w:p>
+      <w:pPr/>
+      <w:r>
+        <w:t>Part III, Chapters 42 to 47, moves from amplifier principles to device technologies and design. Chapter 42 treats CMOS power amplifiers and breakdown limits; Chapter 43 is a class-by-class design cookbook. Chapter 44 develops a GaAs handset amplifier and pHEMT; Chapter 45 designs GaN broadband, Doherty, and space amplifiers. Chapter 46 designs RF SOI switches and surveys SiGe, InP, and emerging materials for millimeter and submillimeter waves. Chapter 47 designs with acoustic and micromechanical filters used in smartphone front ends.</w:t>
+      </w:r>
+    </w:p>
+    <w:p>
+      <w:pPr/>
+      <w:r>
+        <w:t>Part IV, Chapters 48 to 52, starts with measured data and ends at the bench. It covers Touchstone files and noise parameters, FMCW radar front ends, microwave photonics and optical phased arrays, buildable receivers, and antennas for satellites, GPS, LoRa, and the wider radio spectrum.</w:t>
       </w:r>
     </w:p>
     <w:p>

</xml_diff>

<commit_message>
Book 4: repair class E solution and add dry humor; DOCX rebuilt
</commit_message>
<xml_diff>
--- a/EE - SERIES/RF_Microwave_and_Transceivers_Book4.docx
+++ b/EE - SERIES/RF_Microwave_and_Transceivers_Book4.docx
@@ -562,7 +562,7 @@
     </w:p>
     <w:p>
       <w:r>
-        <w:t>Mount a 10 pF capacitor on its pads, feed it 2.45 GHz, and it is no longer a capacitor. Its 0.8 nH of mounted inductance resonates with it at 1.78 GHz, and above that frequency the part behaves as a small inductor. Nothing about the part changed. The frequency did, and that is the whole subject of this book.</w:t>
+        <w:t>Mount a 10 pF capacitor on its pads, feed it 2.45 GHz, and it is no longer a capacitor. Its 0.8 nH of mounted inductance resonates with it at 1.78 GHz, and above that frequency the part behaves as a small inductor. Nothing about the part changed. The frequency did, and that is the whole subject of this book. The capacitor keeps its name on the packet; the circuit has other opinions.</w:t>
       </w:r>
     </w:p>
     <w:p>
@@ -22209,7 +22209,7 @@
         <w:t xml:space="preserve">Solution. </w:t>
       </w:r>
       <w:r>
-        <w:t>R = 0.5768 × 24²/10 = 33.2 Ω. C = 0.1836/(2π × 6.78×10⁶ × 33.2) = 130 pF, which may include the switch's own output capacitance. The excess reactance is 1.1525 × 33.2 = 38.3 Ω, 0.90 µH. The DC current is 10/24 = 0.417 A and the peak switch current 2.862 × 0.417 = 1.19 A. The switch peaks at 3.562 × 24 = 85.5 V, so a 150 V device leaves the margin a resonant load that drifts with the receiver's position needs. The simulation in Figure 43.1 shows the drain voltage returning to zero with zero slope as the swit</w:t>
+        <w:t>R = 0.5768 × 24²/10 = 33.2 Ω. C = 0.1836/(2π × 6.78×10⁶ × 33.2) = 130 pF, which may include the switch's own output capacitance. The excess reactance is 1.1525 × 33.2 = 38.3 Ω, 0.90 µH. The DC current is 10/24 = 0.417 A and the peak switch current 2.862 × 0.417 = 1.19 A. The switch peaks at 3.562 × 24 = 85.5 V, leaving 64.5 V of nominal headroom with a 150 V-rated device. The simulation in Figure 43.1 shows the drain voltage returning to zero with zero slope as the swit</w:t>
       </w:r>
       <w:r>
         <w:t>ch closes. A wireless charger's coil coupling changes the load, so practical designs use load-insensitive class E variants or a matching network that is retuned as the receiver moves. Bipolar version: no change in the network; the switch is a GaN or silicon MOSFET, because a bipolar switch's storage time would spoil the zero-voltage timing.</w:t>
@@ -26533,7 +26533,7 @@
     </w:p>
     <w:p>
       <w:r>
-        <w:t>A coil, a variable capacitor, a germanium diode, and a long wire will pull a radio station out of the air with no battery at all. A few more parts make a Morse transmitter that can reach across a continent on a watt when propagation and the antenna cooperate, and a twenty-dollar USB dongle can receive signals from aircraft and weather satellites.</w:t>
+        <w:t>A coil, a variable capacitor, a germanium diode, and a long wire will pull a radio station out of the air with no battery at all. The station supplies both the signal and the power, if it is generous enough. A few more parts make a one- to five-watt Morse transmitter; a continent-spanning contact is possible when propagation and the antenna cooperate. A twenty-dollar USB dongle receives aircraft and weather satellites. Building these receivers and transmitters teaches the ideas of this book faster than any amount of reading.</w:t>
       </w:r>
     </w:p>
     <w:p>

</xml_diff>

<commit_message>
Revise EE Book 4 after critical review
</commit_message>
<xml_diff>
--- a/EE - SERIES/RF_Microwave_and_Transceivers_Book4.docx
+++ b/EE - SERIES/RF_Microwave_and_Transceivers_Book4.docx
@@ -92,12 +92,7 @@
       </w:r>
     </w:p>
     <w:p>
-      <w:r>
-        <w:t>Each chapter states the question it answers, develops the picture in words, and then works it through with declared numbers. Every number in a worked example was computed, not estimated, and every practice problem is worked in full in Appendix B, with the idea, the numbers, and a check. The book uses one set of reference values throughout: the speed of light is 2.998 × 10⁸ m/s, the system reference impedance is 50 Ω, and the reference board has εr = 3.55. The link-budget anchor is the Friis path factor at 2</w:t>
-      </w:r>
-      <w:r>
-        <w:t>.45 GHz over 100 m between isotropic antennas, 9.48 × 10⁻⁹, or −80.2 dB, and the load-line anchors for 100 W are Ropt = 10.13 Ω at 50 V with a 5 V knee and 3.13 Ω at 28 V with a 3 V knee.</w:t>
-      </w:r>
+      <w:r/>
     </w:p>
     <w:p>
       <w:r>
@@ -242,7 +237,7 @@
     <w:p>
       <w:hyperlink w:anchor="_TocAll0019" w:history="1">
         <w:r>
-          <w:t>Chapter 18. A Bandpass Filter from Specification to Layout</w:t>
+          <w:t>Chapter 18. A Bandpass Filter from Specification to Coupling Design</w:t>
         </w:r>
       </w:hyperlink>
     </w:p>
@@ -2498,10 +2493,7 @@
     </w:p>
     <w:p>
       <w:r>
-        <w:t>At low frequency a two-port network is described by impedances or admittances measured with its ports open or shorted. At radio frequencies those measurements are impossible: an open circuit radiates, a short circuit has inductance, and an active device presented with either may oscillate. Scattering parameters avoid the problem by describing a network in terms of waves going in and waves coming out with every port terminated in the reference impedance, normally 50 Ω. Every RF datasheet, every simulator, an</w:t>
-      </w:r>
-      <w:r>
-        <w:t>d every network analyzer speaks this language, and this chapter teaches enough of it to read, convert, and use the numbers.</w:t>
+        <w:t>At low frequencies, two-port impedance and admittance parameters can be measured with open- and short-circuit terminations. At microwave frequencies, ideal opens and shorts are hard to realize: fixtures add capacitance and inductance, radiation and calibration errors matter, and a strongly mismatched termination may drive an active device outside its safe operating conditions. S-parameters avoid requiring ideal open or short circuits at the ports; they describe traveling waves referenced to matched impedances, normally 50 Ω. Every RF datasheet, simulator, and network analyzer uses this language, and this chapter teaches enough to read, convert, and use the numbers.</w:t>
       </w:r>
     </w:p>
     <w:p>
@@ -3057,10 +3049,7 @@
     </w:p>
     <w:p>
       <w:r>
-        <w:t>A filter is a matching network that refuses to match outside its passband. Inside the band it presents the source impedance and passes the signal; outside it presents a reactance and reflects it. This chapter builds filters in three steps: the low-pass prototype that sets the shape of the response, the transformations that turn it into a real low-pass or band-pass circuit, and the resonator quality factor that decides how much of the passband signal the filter loses. The last of those steps leads from micro</w:t>
-      </w:r>
-      <w:r>
-        <w:t>strip to cavities and waveguide, which is where high-power and low-loss filters live.</w:t>
+        <w:t>A filter is a network designed to transmit one frequency range and attenuate others. In an ideal lossless prototype with matched terminations, stopband power is reflected. Real filters also dissipate power, and absorptive designs intentionally terminate stopband energy rather than reflect it. This chapter builds filters in three steps: the low-pass prototype that sets the response shape, the transformations that turn it into a real low-pass or band-pass circuit, and the resonator quality factor that determines passband loss. That leads from microstrip to cavities and waveguide, where high-power and low-loss filters are built.</w:t>
       </w:r>
     </w:p>
     <w:p>
@@ -3558,10 +3547,7 @@
     </w:p>
     <w:p>
       <w:r>
-        <w:t>An antenna is the matching network between a transmission line and free space. Its terminals present an impedance like any other load, and the power that enters them leaves as a wave whose strength depends on direction. This chapter defines the handful of numbers that describe an antenna, directivity, efficiency, gain, effective aperture, and polarization, derives the link equation that combines two antennas and a distance, and sizes the two antennas most boards actually use, the dipole and the patch. The a</w:t>
-      </w:r>
-      <w:r>
-        <w:t>ntenna gains in this chapter are the ones every link budget in the series uses; transmitter power is Part II's and the legal limit on what is radiated is Book 7's.</w:t>
+        <w:t>An antenna is a transducer between guided waves on a transmission line and electromagnetic waves in space. Its input impedance determines how much power is accepted at its feed; an external matching network may transform the line impedance to that input impedance. Matching and radiation are related, but they are different jobs.</w:t>
       </w:r>
     </w:p>
     <w:p>
@@ -4094,7 +4080,7 @@
     </w:p>
     <w:p>
       <w:r>
-        <w:t>How does a flat panel on a 5G mast point its beam at a phone a block away without moving a single part? It delays each element's signal a little more than its neighbor's. With half-wavelength spacing, a phase step of −90° from one element to the next swings the beam 30° off broadside, and the electronics can do that in microseconds.</w:t>
+        <w:t>How does a flat panel on a 5G mast point its beam at a phone a block away without moving a single part? It changes the relative phase of the signals fed to its elements. With half-wavelength spacing, a phase step of −90° from one element to the next steers the beam 30° off broadside. A true-time-delay array uses actual delays; phase-shifter arrays approximate them at a chosen frequency and can show beam squint across wide bandwidths.</w:t>
       </w:r>
     </w:p>
     <w:p>
@@ -5129,10 +5115,7 @@
     </w:p>
     <w:p>
       <w:r>
-        <w:t>In microstrip, part of the field lies in the substrate and part in the air above it, so the wave travels at a speed set by an effective permittivity between 1 and εr. Wider traces put more of the field in the substrate and raise εeff; they also lower the impedance. Hammerstad's equations, as given in Pozar, express both in terms of the width-to-height ratio u = W/h, accurate to about 1% for most practical boards. Designers usually need the inverse: the width that gives 50 Ω. Wheeler's synthesis formula prov</w:t>
-      </w:r>
-      <w:r>
-        <w:t>ides it in closed form.</w:t>
+        <w:t>In microstrip, part of the field lies in the substrate and part in the air above it, so the wave travels at a speed set by an effective permittivity between 1 and εr. Wider traces put more field in the substrate and lower the impedance. The Hammerstad models give compact quasi-static estimates from the width-to-height ratio u = W/h. The narrow- and wide-strip equations differ; their assumptions include negligible copper thickness and a uniform substrate. Designers invert the model numerically for a target impedance, then use a field solver and fabrication coupon when thickness, discontinuities, or frequency make the approximation inadequate.</w:t>
       </w:r>
     </w:p>
     <w:p>
@@ -5140,7 +5123,15 @@
         <w:jc w:val="center"/>
       </w:pPr>
       <w:r>
-        <w:t>εeff = (εr + 1)/2 + (εr − 1)/(2√(1 + 12/u));   Z0 = 120π / [√εeff (u + 1.393 + 0.667 ln(u + 1.444))]  (u ≥ 1)</w:t>
+        <w:t>For u ≥ 1: εeff = (εr + 1)/2 + (εr − 1)/(2√(1 + 12/u));  Z₀ = 120π/[√εeff (u + 1.393 + 0.667 ln(u + 1.444))]</w:t>
+      </w:r>
+    </w:p>
+    <w:p>
+      <w:pPr>
+        <w:jc w:val="center"/>
+      </w:pPr>
+      <w:r>
+        <w:t xml:space="preserve">For u ≤ 1: εeff = (εr + 1)/2 + (εr − 1)/2 × [(1 + 12/u)^(−1/2) + 0.04(1 − u)²];  Z₀ = (60/√εeff) ln(8/u + u/4)</w:t>
       </w:r>
     </w:p>
     <w:p>
@@ -5609,7 +5600,7 @@
     </w:p>
     <w:p>
       <w:r>
-        <w:t>An L-network's Q, from Chapter 3, is fixed by the ratio of the resistances: Q = √(Rhigh/Rlow − 1). A higher Q means a narrower band, roughly f0/Q for the match to stay within a few decibels of return loss. Matching 50 Ω to 100 Ω needs Q = 1 and is naturally broadband; matching 50 Ω to 500 Ω needs Q = 3. The cure for a high ratio is to split the transformation into steps, each with a lower Q: two L-sections through an intermediate resistance, or several quarter-wave sections whose impedances step gradually.</w:t>
+        <w:t>An L-network's Q, from Chapter 3, is fixed by the resistance ratio. For a given topology and a stated match criterion, higher Q generally means narrower bandwidth; Δf/f₀ ≈ 1/Q is a rough estimate, not a universal bandwidth law. Matching 50 Ω to 100 Ω needs Q = 1 and is naturally broad compared with a 50 Ω to 500 Ω match, which needs Q = 3. A high-ratio transformation can be split into steps, each with a lower Q: two L-sections through an intermediate resistance or several quarter-wave sections whose impedances step gradually.</w:t>
       </w:r>
     </w:p>
     <w:p>
@@ -6503,10 +6494,7 @@
     </w:p>
     <w:p>
       <w:r>
-        <w:t>An antenna that fits inside a sphere of radius a much smaller than a wavelength stores far more reactive energy than it radiates, so it has a high Q and a narrow bandwidth. Chu's limit, refined by McLean, gives the minimum Q of any antenna inside that sphere: Q = 1/(ka)³ + 1/(ka), with k = 2π/λ. The fractional bandwidth for a given VSWR s is at most about (s − 1)/(Q√s). Matching networks cannot beat it, by the same argument as Chapter 11's Bode-Fano limit. Adding loss broadens the band but wastes power, whi</w:t>
-      </w:r>
-      <w:r>
-        <w:t>ch is how many tiny antennas meet their bandwidth specifications.</w:t>
+        <w:t>An antenna contained inside a sphere of radius a much smaller than a wavelength stores far more reactive energy than it radiates, so its radiation Q is high and its lossless matched bandwidth is narrow. Chu’s bound, refined by McLean, gives the minimum radiation Q for this idealized enclosing-sphere problem: Q = 1/(ka)³ + 1/(ka), with k = 2π/λ. The following VSWR bandwidth relation is an approximate single-resonance estimate; real bandwidth also depends on the matching network, efficiency, and the antenna’s frequency-dependent pattern.</w:t>
       </w:r>
     </w:p>
     <w:p>
@@ -8835,10 +8823,8 @@
       <w:pPr>
         <w:pStyle w:val="Heading1"/>
       </w:pPr>
-      <w:bookmarkStart w:id="18" w:name="_TocAll0019"/>
-      <w:bookmarkEnd w:id="18"/>
-      <w:r>
-        <w:t>Chapter 18. A Bandpass Filter from Specification to Layout</w:t>
+      <w:r>
+        <w:t>Chapter 18. A Bandpass Filter from Specification to Coupling Design</w:t>
       </w:r>
     </w:p>
     <w:p>
@@ -8973,6 +8959,11 @@
       </w:r>
       <w:r>
         <w:t>Qe = 1.0316/0.04 = 25.8. M₁₂ = M₂₃ = 0.04/√(1.0316 × 1.1474) = 0.04/1.088 = 0.0368. The layout must now produce a tap or gap that loads the end resonators to Qe = 25.8, and gaps between resonators that couple them by 3.68%. Electromagnetic simulation of two resonators at a time finds those dimensions: the coupling is half the fractional separation of the two resonant peaks a pair of coupled resonators shows.</w:t>
+      </w:r>
+    </w:p>
+    <w:p>
+      <w:r>
+        <w:t xml:space="preserve">These coupling numbers are not physical gap dimensions. A buildable layout requires a specified substrate stack-up, resonator geometry, feed launches, copper thickness, and enclosure. Simulate resonator pairs in that stack-up, tune their gaps or overlap until the extracted coupling matches M₁₂, extract the end-resonator external Q, then simulate the complete filter with its feeds and finite ground. The ideal response above is a target for that process, not a prediction of the fabricated response; measure and tune the prototype before treating its rejection as achieved.</w:t>
       </w:r>
     </w:p>
     <w:p>
@@ -16041,7 +16032,7 @@
     </w:p>
     <w:p>
       <w:r>
-        <w:t>Is it safe to stand in front of a cell-site antenna? For a sector radiating 36 dBW at 3.5 GHz, the general-public limit is met about 9 m away in the main beam, counting a ground reflection. The beam is narrow in elevation and the antenna sits high, so people on the ground are usually well outside it. The arithmetic is simple, and it is what regulators check.</w:t>
+        <w:t>Is it safe to stand in front of a cell-site antenna? A first-pass calculation for a sector antenna radiating 36 dBW at 3.5 GHz puts the general-public limit about 9 m away in the main beam when the usual conservative ground-reflection factor is included. That estimate is a screening calculation, not a compliance determination: actual assessment depends on the applicable rules, antenna pattern, averaging, installation, accessible locations, and exposure from other sources.</w:t>
       </w:r>
     </w:p>
     <w:p>
@@ -16061,10 +16052,7 @@
     </w:p>
     <w:p>
       <w:r>
-        <w:t>A transmitter that radiates kilowatts of EIRP is also a source of radio-frequency energy absorbed by people nearby. At the frequencies in this book the established effect of that energy is heating, and exposure limits are set with large safety factors below the levels that cause measurable heating. Every licensed transmitter, base station, and phone must show compliance. This chapter explains the two quantities the limits use, power density and specific absorption rate, and how an engineer finds the distanc</w:t>
-      </w:r>
-      <w:r>
-        <w:t>e at which an antenna becomes compliant.</w:t>
+        <w:t>A transmitter that radiates kilowatts of EIRP can expose people nearby to radio-frequency energy. For the frequency range covered here, the established adverse effect addressed by exposure limits is excessive heating; the limits include safety margins below levels associated with harmful temperature rises. Equipment authorization and site assessments must follow the rules that apply in their jurisdiction and use case. This chapter introduces power density and specific absorption rate, then shows how to estimate distance in a simplified far-field model.</w:t>
       </w:r>
     </w:p>
     <w:p>
@@ -16258,10 +16246,7 @@
     </w:p>
     <w:p>
       <w:r>
-        <w:t>Close to the body, a device's field couples directly into tissue, and the far-field density is meaningless. SAR, the power absorbed per kilogram, is measured with a probe scanning inside a tissue-simulating liquid in a phantom of the head or body, while the device transmits at full power. The limit of 1.6 W/kg over 1 g is a heating rate: in tissue with a heat capacity near 3600 J/kg/K, it would raise the temperature by about 0.027 K per minute if no heat were carried away, and blood flow removes much of it.</w:t>
-      </w:r>
-      <w:r>
-        <w:t xml:space="preserve"> Phones meet the limit by antenna placement and by reducing power when sensors detect the head or body nearby. Above about 6 GHz, where energy is absorbed close to the skin surface, the newer rules switch from SAR to absorbed power density over a small area of skin.</w:t>
+        <w:t>Close to the body, a device's field couples directly into tissue, and a far-field power-density estimate is not the right local metric. SAR is power absorbed per kilogram; handset test procedures use tissue-simulating liquid and defined phantoms and test positions. The FCC general-population limit for portable-device SAR is 1.6 W/kg averaged over 1 g. That is a regulatory exposure metric, not a prediction that a device raises the whole gram uniformly by a fixed temperature each minute: heat spreads and blood flow matters. Compliance can be achieved through antenna placement, operating-power limits, and, in some designs, proximity sensing with power reduction. Above 6 GHz the metric and procedure depend on the jurisdiction. FCC rules use maximum permissible exposure limits; ICNIRP 2020 uses local absorbed power density averaged over specified tissue areas and times. Do not substitute one regime for the other.</w:t>
       </w:r>
     </w:p>
     <w:p>
@@ -16274,10 +16259,7 @@
     </w:p>
     <w:p>
       <w:r>
-        <w:t>For a new site, the engineer computes the exposure from every transmitter there, adds their contributions as fractions of their own limits, and checks that the sum stays below one in accessible areas. Where it does not, the site uses signs, barriers, and procedures, and workers power down or reduce the antennas before working in front of them. Measurement with broadband or frequency-selective probes confirms the calculation. Massive MIMO base stations, whose beams move, are assessed using the actual time-av</w:t>
-      </w:r>
-      <w:r>
-        <w:t>eraged power in each direction, which is usually well below the theoretical maximum.</w:t>
+        <w:t>For a site assessment, the engineer accounts for relevant transmitters and sums exposure contributions under the applicable jurisdictional method, then checks accessible areas against the correct limits and averaging rules. If the assessment identifies an exceedance, controls may include signs, barriers, access restrictions, or reduced power. Measurements with suitable broadband or frequency-selective probes can validate an assessment. Massive-MIMO systems need methods that account for beam behavior and time averaging; an assumed maximum beam is not interchangeable with a measured or rule-defined exposure average.</w:t>
       </w:r>
     </w:p>
     <w:p>
@@ -16299,7 +16281,7 @@
         <w:spacing w:after="120"/>
       </w:pPr>
       <w:r>
-        <w:t>Do the far-field power-density calculation early, with the ground-reflection factor, and mark the compliance boundary on the site drawing. For body-worn products SAR testing is the expensive item, and the antenna's position relative to the body is what decides it, so changing it late in a design is costly. Keep the calculation, the limits used, and their edition with the compliance file.</w:t>
+        <w:t>Use the far-field power-density model early as a screening estimate, with the assumptions and ground-reflection factor shown on the site drawing. Treat the resulting distance as a prompt for the applicable full assessment, not as a certified boundary. For body-worn products SAR testing is expensive, and antenna position relative to the body can drive the result, so changing it late in a design is costly. Keep the calculation, limits, methods, and edition with the compliance file.</w:t>
       </w:r>
     </w:p>
     <w:p>
@@ -20217,7 +20199,7 @@
     </w:p>
     <w:p>
       <w:r>
-        <w:t>The book has no tables in its text, so the comparison is given as rows, one per class, each in the same order: how the device operates, its ideal peak efficiency, what is achieved in practice at a few gigahertz, its linearity, its peak drain voltage, and where it is used.</w:t>
+        <w:t>Compare each class by its operating mode, ideal efficiency ceiling, typical practical range, linearity, peak drain voltage, and common use. The practical ranges below are orientation, not promises: device, frequency, matching, signal statistics, thermal design, and measurement conditions can move them substantially.</w:t>
       </w:r>
     </w:p>
     <w:p>

</xml_diff>